<commit_message>
Increase AI-900 assessment cover sizing
</commit_message>
<xml_diff>
--- a/Assessments/Answer to PP Assessment - Microsoft Azure AI Fundamentals AI-900 - v1.docx
+++ b/Assessments/Answer to PP Assessment - Microsoft Azure AI Fundamentals AI-900 - v1.docx
@@ -4,13 +4,13 @@
   <w:body>
     <w:p>
       <w:pPr>
-        <w:spacing w:before="760" w:after="80"/>
+        <w:spacing w:before="920" w:after="160"/>
         <w:jc w:val="center"/>
       </w:pPr>
       <w:r>
         <w:drawing>
           <wp:inline xmlns:a="http://schemas.openxmlformats.org/drawingml/2006/main" xmlns:pic="http://schemas.openxmlformats.org/drawingml/2006/picture">
-            <wp:extent cx="1005840" cy="1005840"/>
+            <wp:extent cx="1417320" cy="1417320"/>
             <wp:docPr id="1" name="Picture 1"/>
             <wp:cNvGraphicFramePr>
               <a:graphicFrameLocks noChangeAspect="1"/>
@@ -31,7 +31,7 @@
                   <pic:spPr>
                     <a:xfrm>
                       <a:off x="0" y="0"/>
-                      <a:ext cx="1005840" cy="1005840"/>
+                      <a:ext cx="1417320" cy="1417320"/>
                     </a:xfrm>
                     <a:prstGeom prst="rect"/>
                   </pic:spPr>
@@ -44,7 +44,7 @@
     </w:p>
     <w:p>
       <w:pPr>
-        <w:spacing w:after="100"/>
+        <w:spacing w:after="40"/>
         <w:jc w:val="center"/>
       </w:pPr>
       <w:r>
@@ -52,14 +52,14 @@
           <w:rFonts w:ascii="Arial" w:hAnsi="Arial"/>
           <w:b/>
           <w:color w:val="111827"/>
-          <w:sz w:val="20"/>
+          <w:sz w:val="23"/>
         </w:rPr>
         <w:t>Tertiary Infotech Academy Pte Ltd</w:t>
       </w:r>
     </w:p>
     <w:p>
       <w:pPr>
-        <w:spacing w:after="100"/>
+        <w:spacing w:after="400"/>
         <w:jc w:val="center"/>
       </w:pPr>
       <w:r>
@@ -67,14 +67,14 @@
           <w:rFonts w:ascii="Arial" w:hAnsi="Arial"/>
           <w:b w:val="0"/>
           <w:color w:val="555B66"/>
-          <w:sz w:val="16"/>
+          <w:sz w:val="17"/>
         </w:rPr>
         <w:t>UEN: 201200696W</w:t>
       </w:r>
     </w:p>
     <w:p>
       <w:pPr>
-        <w:spacing w:after="100" w:before="200"/>
+        <w:spacing w:after="240" w:before="0"/>
         <w:jc w:val="center"/>
       </w:pPr>
       <w:r>
@@ -82,14 +82,14 @@
           <w:rFonts w:ascii="Arial" w:hAnsi="Arial"/>
           <w:b/>
           <w:color w:val="1F6FEB"/>
-          <w:sz w:val="48"/>
+          <w:sz w:val="54"/>
         </w:rPr>
         <w:t>ANSWER TO PRACTICAL PERFORMANCE ASSESSMENT</w:t>
       </w:r>
     </w:p>
     <w:p>
       <w:pPr>
-        <w:spacing w:after="100"/>
+        <w:spacing w:after="160"/>
         <w:jc w:val="center"/>
       </w:pPr>
       <w:r>
@@ -97,20 +97,20 @@
           <w:rFonts w:ascii="Arial" w:hAnsi="Arial"/>
           <w:b w:val="0"/>
           <w:color w:val="555B66"/>
-          <w:sz w:val="16"/>
+          <w:sz w:val="18"/>
         </w:rPr>
         <w:t>For</w:t>
       </w:r>
     </w:p>
     <w:p>
       <w:pPr>
-        <w:spacing w:after="280"/>
+        <w:spacing w:after="600"/>
         <w:jc w:val="center"/>
       </w:pPr>
       <w:r>
         <w:drawing>
           <wp:inline xmlns:a="http://schemas.openxmlformats.org/drawingml/2006/main" xmlns:pic="http://schemas.openxmlformats.org/drawingml/2006/picture">
-            <wp:extent cx="868680" cy="558437"/>
+            <wp:extent cx="1234440" cy="793569"/>
             <wp:docPr id="2" name="Picture 2"/>
             <wp:cNvGraphicFramePr>
               <a:graphicFrameLocks noChangeAspect="1"/>
@@ -131,7 +131,7 @@
                   <pic:spPr>
                     <a:xfrm>
                       <a:off x="0" y="0"/>
-                      <a:ext cx="868680" cy="558437"/>
+                      <a:ext cx="1234440" cy="793569"/>
                     </a:xfrm>
                     <a:prstGeom prst="rect"/>
                   </pic:spPr>
@@ -144,7 +144,7 @@
     </w:p>
     <w:p>
       <w:pPr>
-        <w:spacing w:after="100"/>
+        <w:spacing w:after="260"/>
         <w:jc w:val="center"/>
       </w:pPr>
       <w:r>
@@ -152,14 +152,14 @@
           <w:rFonts w:ascii="Arial" w:hAnsi="Arial"/>
           <w:b/>
           <w:color w:val="111827"/>
-          <w:sz w:val="36"/>
+          <w:sz w:val="42"/>
         </w:rPr>
         <w:t>Microsoft Azure AI Fundamentals (AI-900)</w:t>
       </w:r>
     </w:p>
     <w:p>
       <w:pPr>
-        <w:spacing w:after="100"/>
+        <w:spacing w:after="240"/>
         <w:jc w:val="center"/>
       </w:pPr>
       <w:r>
@@ -167,14 +167,14 @@
           <w:rFonts w:ascii="Arial" w:hAnsi="Arial"/>
           <w:b w:val="0"/>
           <w:color w:val="111827"/>
-          <w:sz w:val="18"/>
+          <w:sz w:val="20"/>
         </w:rPr>
         <w:t>TGS Ref No: TGS-2023021100</w:t>
       </w:r>
     </w:p>
     <w:p>
       <w:pPr>
-        <w:spacing w:after="100"/>
+        <w:spacing w:after="20"/>
         <w:jc w:val="center"/>
       </w:pPr>
       <w:r>
@@ -182,14 +182,14 @@
           <w:rFonts w:ascii="Arial" w:hAnsi="Arial"/>
           <w:b w:val="0"/>
           <w:color w:val="555B66"/>
-          <w:sz w:val="16"/>
+          <w:sz w:val="17"/>
         </w:rPr>
         <w:t>Conducted by</w:t>
       </w:r>
     </w:p>
     <w:p>
       <w:pPr>
-        <w:spacing w:after="100"/>
+        <w:spacing w:after="20"/>
         <w:jc w:val="center"/>
       </w:pPr>
       <w:r>
@@ -197,14 +197,14 @@
           <w:rFonts w:ascii="Arial" w:hAnsi="Arial"/>
           <w:b/>
           <w:color w:val="111827"/>
-          <w:sz w:val="20"/>
+          <w:sz w:val="21"/>
         </w:rPr>
         <w:t>Tertiary Infotech Academy Pte Ltd</w:t>
       </w:r>
     </w:p>
     <w:p>
       <w:pPr>
-        <w:spacing w:after="100"/>
+        <w:spacing w:after="260"/>
         <w:jc w:val="center"/>
       </w:pPr>
       <w:r>
@@ -212,14 +212,14 @@
           <w:rFonts w:ascii="Arial" w:hAnsi="Arial"/>
           <w:b w:val="0"/>
           <w:color w:val="555B66"/>
-          <w:sz w:val="16"/>
+          <w:sz w:val="17"/>
         </w:rPr>
         <w:t>UEN: 201200696W</w:t>
       </w:r>
     </w:p>
     <w:p>
       <w:pPr>
-        <w:spacing w:after="100"/>
+        <w:spacing w:after="0"/>
         <w:jc w:val="center"/>
       </w:pPr>
       <w:r>
@@ -227,7 +227,7 @@
           <w:rFonts w:ascii="Arial" w:hAnsi="Arial"/>
           <w:b/>
           <w:color w:val="1F6FEB"/>
-          <w:sz w:val="20"/>
+          <w:sz w:val="22"/>
         </w:rPr>
         <w:t>Version v1</w:t>
       </w:r>

</xml_diff>